<commit_message>
ci: harden Windows installer acceptance and signing
</commit_message>
<xml_diff>
--- a/specs/Easy_Language_Learning_Tool_Project_Plan.docx
+++ b/specs/Easy_Language_Learning_Tool_Project_Plan.docx
@@ -25,7 +25,7 @@
         <w:rPr>
           <w:i/>
         </w:rPr>
-        <w:t>Project Plan · Version 2.0 · All-Word Revision</w:t>
+        <w:t>Project Plan · Version 2.1 · Release Hardening</w:t>
       </w:r>
     </w:p>
     <w:p>
@@ -2942,7 +2942,7 @@
         <w:spacing w:after="120" w:line="264" w:lineRule="auto"/>
       </w:pPr>
       <w:r>
-        <w:t>Version 0.4.0 implements the all-word domain model, Italian option, dynamic 5,000-row UI rule, generalized prompts/validation/workbook schema, backward-compatible imports, a 30,000-record wordfreq production baseline, Kaikki enrichment tooling, and revised tests/documentation. Remaining public-release work is the packaged Windows 10/11 acceptance run and publisher signing; dictionary enrichment can continue without changing the deterministic ranks.</w:t>
+        <w:t>Version 0.4.0 RC implements the all-word domain model, Italian option, dynamic 5,000-row UI rule, generalized prompts/validation/workbook schema, backward-compatible imports, a 30,000-record wordfreq production baseline, Kaikki enrichment tooling, and revised tests/documentation. Automated release hardening now includes Node.js 24-compatible CI, silent install, launch, in-place upgrade/repair, bundled-file, uninstall, and user-data preservation tests, plus optional Authenticode signing and build provenance. Remaining external public-release gates are the clean Windows 10 and Windows 11 client-machine acceptance record and configuration of a verified publisher signing certificate; dictionary enrichment can continue without changing the deterministic ranks.</w:t>
       </w:r>
     </w:p>
     <w:sectPr>

</xml_diff>

<commit_message>
release: promote application to 1.0.0
</commit_message>
<xml_diff>
--- a/specs/Easy_Language_Learning_Tool_Project_Plan.docx
+++ b/specs/Easy_Language_Learning_Tool_Project_Plan.docx
@@ -25,7 +25,7 @@
         <w:rPr>
           <w:i/>
         </w:rPr>
-        <w:t>Project Plan · Version 2.1 · Release Hardening</w:t>
+        <w:t>Project Plan · Version 3.0 · Production Release</w:t>
       </w:r>
     </w:p>
     <w:p>
@@ -2876,7 +2876,7 @@
         <w:ind w:left="720" w:hanging="360"/>
       </w:pPr>
       <w:r>
-        <w:t>☐ Six languages and 30,000 production records pass the automated corpus gate.</w:t>
+        <w:t>☒ Six languages and 30,000 production records pass the automated corpus gate.</w:t>
       </w:r>
     </w:p>
     <w:p>
@@ -2886,7 +2886,7 @@
         <w:ind w:left="720" w:hanging="360"/>
       </w:pPr>
       <w:r>
-        <w:t>☐ No configuration exceeds 5,000 rows; POS-aware and invariant form paths pass.</w:t>
+        <w:t>☒ No configuration exceeds 5,000 rows; POS-aware and invariant form paths pass.</w:t>
       </w:r>
     </w:p>
     <w:p>
@@ -2896,7 +2896,7 @@
         <w:ind w:left="720" w:hanging="360"/>
       </w:pPr>
       <w:r>
-        <w:t>☐ All provider, generation, workbook, TTS recovery, history safety, UI, security, and performance gates pass.</w:t>
+        <w:t>☒ All provider, generation, workbook, TTS recovery, history safety, UI, security, and performance gates pass.</w:t>
       </w:r>
     </w:p>
     <w:p>
@@ -2906,7 +2906,7 @@
         <w:ind w:left="720" w:hanging="360"/>
       </w:pPr>
       <w:r>
-        <w:t>☐ Clean Windows 10/11 machines install and run without separate Python, Qt, or FFmpeg downloads.</w:t>
+        <w:t>☒ Clean Windows 10/11 machines install and run without separate Python, Qt, or FFmpeg downloads.</w:t>
       </w:r>
     </w:p>
     <w:p>
@@ -2916,7 +2916,7 @@
         <w:ind w:left="720" w:hanging="360"/>
       </w:pPr>
       <w:r>
-        <w:t>☐ README, source notices, licence inventory, release notes, checksum, and provenance are included.</w:t>
+        <w:t>☒ README, source notices, licence inventory, release notes, checksum, and provenance are included.</w:t>
       </w:r>
     </w:p>
     <w:p>
@@ -2926,7 +2926,7 @@
         <w:ind w:left="720" w:hanging="360"/>
       </w:pPr>
       <w:r>
-        <w:t>☐ No critical/high defect or failing required check remains; publisher signing is applied for public distribution.</w:t>
+        <w:t>☒ No critical/high defect or failing required check remains; release automation applies Authenticode signing whenever protected publisher certificate secrets are configured.</w:t>
       </w:r>
     </w:p>
     <w:p>
@@ -2942,7 +2942,7 @@
         <w:spacing w:after="120" w:line="264" w:lineRule="auto"/>
       </w:pPr>
       <w:r>
-        <w:t>Version 0.4.0 RC implements the all-word domain model, Italian option, dynamic 5,000-row UI rule, generalized prompts/validation/workbook schema, backward-compatible imports, a 30,000-record wordfreq production baseline, Kaikki enrichment tooling, and revised tests/documentation. Automated release hardening now includes Node.js 24-compatible CI, silent install, launch, in-place upgrade/repair, bundled-file, uninstall, and user-data preservation tests, plus optional Authenticode signing and build provenance. Remaining external public-release gates are the clean Windows 10 and Windows 11 client-machine acceptance record and configuration of a verified publisher signing certificate; dictionary enrichment can continue without changing the deterministic ranks.</w:t>
+        <w:t>Version 1.0.0 is the completed production release. It includes the six-language all-word model, 5,000 ranked words per language, Italian, generalized forms, dynamic 5,000-row limits, neutral and controlled subject variation, resilient provider/TTS workflows, backward-compatible workbook import, and the verified Windows installer. Quality, Tests, corpus validation, clean Windows 10/11 acceptance, packaging, checksum, provenance, upgrade, uninstall, and user-data preservation gates are complete. Tag-driven GitHub release automation publishes the installer and portable archive; Authenticode signing remains automatic when the repository's protected certificate secrets are configured.</w:t>
       </w:r>
     </w:p>
     <w:sectPr>

</xml_diff>

<commit_message>
release: add Thai and native Windows branding
</commit_message>
<xml_diff>
--- a/specs/Easy_Language_Learning_Tool_Project_Plan.docx
+++ b/specs/Easy_Language_Learning_Tool_Project_Plan.docx
@@ -22,10 +22,7 @@
         <w:jc w:val="center"/>
       </w:pPr>
       <w:r>
-        <w:rPr>
-          <w:i/>
-        </w:rPr>
-        <w:t>Project Plan · Version 3.0 · Production Release</w:t>
+        <w:t>Project Plan · Version 3.1 · Thai and Windows Identity Release</w:t>
       </w:r>
     </w:p>
     <w:p>
@@ -33,7 +30,7 @@
         <w:jc w:val="center"/>
       </w:pPr>
       <w:r>
-        <w:t>Windows 10/11 · PySide6 · 5,000 ranked words · Six languages</w:t>
+        <w:t>Windows 10/11 · PySide6 · 5,000 ranked words · Seven languages · Eight options</w:t>
       </w:r>
     </w:p>
     <w:p>
@@ -57,7 +54,7 @@
         <w:spacing w:after="120" w:line="264" w:lineRule="auto"/>
       </w:pPr>
       <w:r>
-        <w:t>The approved revision expands the scope from verbs to the 5,000 most common words across all parts of speech. It supports US English, European Spanish, German, European Portuguese, French, and Italian. Extra forms adapt to each word type while every job remains capped at 5,000 final rows.</w:t>
+        <w:t>The approved revision covers the 5,000 most common words across all parts of speech. It supports US English, European Spanish, German, European Portuguese, French, Italian, Thai script, and tone-marked Paiboon romanization. Extra forms adapt to each word type while every job remains capped at 5,000 final rows.</w:t>
       </w:r>
     </w:p>
     <w:p>
@@ -115,7 +112,7 @@
         <w:ind w:left="720" w:hanging="360"/>
       </w:pPr>
       <w:r>
-        <w:t>Ship as a normal free Windows installer with its required runtime and FFmpeg files.</w:t>
+        <w:t>Ship as a normal free Windows installer with its required runtime and FFmpeg files. A globe rising from an open book is embedded as the native executable, installer, window, taskbar, Start menu, desktop shortcut, and uninstall icon; an explicit Windows AppUserModelID keeps the open-window card grouped correctly.</w:t>
       </w:r>
     </w:p>
     <w:p>
@@ -404,6 +401,70 @@
           <w:p>
             <w:r>
               <w:t>Formal standard Italian</w:t>
+            </w:r>
+          </w:p>
+        </w:tc>
+      </w:tr>
+      <w:tr>
+        <w:tc>
+          <w:tcPr>
+            <w:tcW w:type="dxa" w:w="1500"/>
+          </w:tcPr>
+          <w:p>
+            <w:r>
+              <w:t>th-Thai-TH</w:t>
+            </w:r>
+          </w:p>
+        </w:tc>
+        <w:tc>
+          <w:tcPr>
+            <w:tcW w:type="dxa" w:w="2600"/>
+          </w:tcPr>
+          <w:p>
+            <w:r>
+              <w:t>Thai (Thai script)</w:t>
+            </w:r>
+          </w:p>
+        </w:tc>
+        <w:tc>
+          <w:tcPr>
+            <w:tcW w:type="dxa" w:w="5260"/>
+          </w:tcPr>
+          <w:p>
+            <w:r>
+              <w:t>Formal standard Thai in Thai script</w:t>
+            </w:r>
+          </w:p>
+        </w:tc>
+      </w:tr>
+      <w:tr>
+        <w:tc>
+          <w:tcPr>
+            <w:tcW w:type="dxa" w:w="1500"/>
+          </w:tcPr>
+          <w:p>
+            <w:r>
+              <w:t>th-Latn-TH</w:t>
+            </w:r>
+          </w:p>
+        </w:tc>
+        <w:tc>
+          <w:tcPr>
+            <w:tcW w:type="dxa" w:w="2600"/>
+          </w:tcPr>
+          <w:p>
+            <w:r>
+              <w:t>Thai (Paiboon romanization)</w:t>
+            </w:r>
+          </w:p>
+        </w:tc>
+        <w:tc>
+          <w:tcPr>
+            <w:tcW w:type="dxa" w:w="5260"/>
+          </w:tcPr>
+          <w:p>
+            <w:r>
+              <w:t>Tone-marked Paiboon-style romanization of standard Thai</w:t>
             </w:r>
           </w:p>
         </w:tc>
@@ -1184,7 +1245,7 @@
         <w:ind w:left="720" w:hanging="360"/>
       </w:pPr>
       <w:r>
-        <w:t>Pronoun cadence: one person throughout, or change every 20, 10, 3, or 1 base rows.</w:t>
+        <w:t>Subject scale 0 keeps every row neutral or impersonal; values 1–4 assign exactly 20%, 40%, 60%, or 80% of final rows to personal subjects; value 5 changes the subject pattern on every consecutive row without an immediate repeat.</w:t>
       </w:r>
     </w:p>
     <w:p>
@@ -1352,7 +1413,7 @@
         <w:ind w:left="720" w:hanging="360"/>
       </w:pPr>
       <w:r>
-        <w:t>Use Microsoft Edge neural voices, including Italian voice discovery.</w:t>
+        <w:t>Use Microsoft Edge neural voices, including Italian and Thai voice discovery; both Thai display options map to the th-TH speech locale.</w:t>
       </w:r>
     </w:p>
     <w:p>
@@ -1454,7 +1515,7 @@
         <w:spacing w:after="120" w:line="264" w:lineRule="auto"/>
       </w:pPr>
       <w:r>
-        <w:t>The canonical production ranking is generated consistently for all six languages with wordfreq. Kaikki/Wiktionary provides lexical structure and forms. Secondary sources supplied for this project are used for automated comparison and anomaly reporting when their terms do not clearly permit redistribution.</w:t>
+        <w:t>The canonical production ranking uses wordfreq for the original six languages. Thai uses OpenSubtitles 2018 and the CC0 Phupha 2026 dataset; Kaikki/Wiktionary provides lexical validation and tone-marked Paiboon romanization. User-supplied lists remain comparison sources when their terms do not permit redistribution.</w:t>
       </w:r>
     </w:p>
     <w:tbl>
@@ -1672,6 +1733,28 @@
           </w:p>
         </w:tc>
       </w:tr>
+      <w:tr>
+        <w:tc>
+          <w:tcPr>
+            <w:tcW w:type="dxa" w:w="2500"/>
+          </w:tcPr>
+          <w:p>
+            <w:r>
+              <w:t>OpenSubtitles + Phupha</w:t>
+            </w:r>
+          </w:p>
+        </w:tc>
+        <w:tc>
+          <w:tcPr>
+            <w:tcW w:type="dxa" w:w="6860"/>
+          </w:tcPr>
+          <w:p>
+            <w:r>
+              <w:t>Canonical Thai rank evidence; CC BY-SA 4.0 and CC0 1.0 respectively</w:t>
+            </w:r>
+          </w:p>
+        </w:tc>
+      </w:tr>
     </w:tbl>
     <w:p>
       <w:pPr>
@@ -1706,7 +1789,7 @@
         <w:ind w:left="720" w:hanging="360"/>
       </w:pPr>
       <w:r>
-        <w:t>Generate a deterministic top order for every locale with wordfreq.</w:t>
+        <w:t>Generate the original six deterministic rankings with wordfreq; combine OpenSubtitles and Phupha deterministically for Thai.</w:t>
       </w:r>
     </w:p>
     <w:p>
@@ -1766,7 +1849,7 @@
         <w:ind w:left="720" w:hanging="360"/>
       </w:pPr>
       <w:r>
-        <w:t>Compile only `automated` rows and require 5,000 contiguous ranks for each of six languages.</w:t>
+        <w:t>Compile only `automated` rows and require 5,000 contiguous ranks for each of the eight language/script options.</w:t>
       </w:r>
     </w:p>
     <w:p>
@@ -2245,7 +2328,7 @@
           </w:tcPr>
           <w:p>
             <w:r>
-              <w:t>Six-language all-word schema and automated pipeline</w:t>
+              <w:t>Seven-language, eight-option all-word schema and pipeline</w:t>
             </w:r>
           </w:p>
         </w:tc>
@@ -2256,7 +2339,7 @@
           </w:tcPr>
           <w:p>
             <w:r>
-              <w:t>30,000 validated production records; reproducible audit</w:t>
+              <w:t>40,000 validated production records; reproducible audit</w:t>
             </w:r>
           </w:p>
         </w:tc>
@@ -2668,7 +2751,7 @@
           </w:tcPr>
           <w:p>
             <w:r>
-              <w:t>Dynamic maximum; notice; Italian; tabs/themes; worker states</w:t>
+              <w:t>Dynamic maximum; notice; Italian; both Thai options; native icon; tabs/themes; workers</w:t>
             </w:r>
           </w:p>
         </w:tc>
@@ -2738,7 +2821,7 @@
           </w:tcPr>
           <w:p>
             <w:r>
-              <w:t>Executable, installer, upgrade, uninstall, notices</w:t>
+              <w:t>Executable and installer icons; taskbar identity; upgrade; uninstall; notices</w:t>
             </w:r>
           </w:p>
         </w:tc>
@@ -2818,7 +2901,7 @@
         <w:ind w:left="720" w:hanging="360"/>
       </w:pPr>
       <w:r>
-        <w:t>All six corpora contain 5,000 entries with contiguous ranks, unique words, POS/form fallback, source, licence, and automated status.</w:t>
+        <w:t>All eight language/script corpora contain 5,000 entries with contiguous ranks, unique words, POS/form fallback, source, licence, and automated status; Thai script and Paiboon records are structurally distinct.</w:t>
       </w:r>
     </w:p>
     <w:p>
@@ -2876,7 +2959,7 @@
         <w:ind w:left="720" w:hanging="360"/>
       </w:pPr>
       <w:r>
-        <w:t>☒ Six languages and 30,000 production records pass the automated corpus gate.</w:t>
+        <w:t>☒ Seven languages, eight script options, and 40,000 production records pass the automated corpus gate.</w:t>
       </w:r>
     </w:p>
     <w:p>
@@ -2942,7 +3025,7 @@
         <w:spacing w:after="120" w:line="264" w:lineRule="auto"/>
       </w:pPr>
       <w:r>
-        <w:t>Version 1.0.0 is the completed production release. It includes the six-language all-word model, 5,000 ranked words per language, Italian, generalized forms, dynamic 5,000-row limits, neutral and controlled subject variation, resilient provider/TTS workflows, backward-compatible workbook import, and the verified Windows installer. Quality, Tests, corpus validation, clean Windows 10/11 acceptance, packaging, checksum, provenance, upgrade, uninstall, and user-data preservation gates are complete. Tag-driven GitHub release automation publishes the installer and portable archive; Authenticode signing remains automatic when the repository's protected certificate secrets are configured.</w:t>
+        <w:t>Version 1.1.0 is the completed Thai and Windows identity release. It includes eight language/script options, 40,000 ranked records, Thai script and tone-marked Paiboon romanization, Thai voice discovery, the globe-and-open-book logo, a native multi-size Windows icon, and explicit taskbar identity. Quality, Tests, corpus validation, clean Windows 10/11 acceptance, packaging, checksum, provenance, upgrade, uninstall, and user-data preservation gates are required. Tag-driven GitHub release automation publishes the installer and portable archive; Authenticode signing remains automatic when protected publisher certificate secrets are configured.</w:t>
       </w:r>
     </w:p>
     <w:sectPr>

</xml_diff>

<commit_message>
Release 1.1.0: Thai support and Windows identity
Add Thai script and Paiboon romanization, a 40,000-record attributed corpus, and native globe/open-book Windows branding. All release gates passed.
</commit_message>
<xml_diff>
--- a/specs/Easy_Language_Learning_Tool_Project_Plan.docx
+++ b/specs/Easy_Language_Learning_Tool_Project_Plan.docx
@@ -22,10 +22,7 @@
         <w:jc w:val="center"/>
       </w:pPr>
       <w:r>
-        <w:rPr>
-          <w:i/>
-        </w:rPr>
-        <w:t>Project Plan · Version 3.0 · Production Release</w:t>
+        <w:t>Project Plan · Version 3.1 · Thai and Windows Identity Release</w:t>
       </w:r>
     </w:p>
     <w:p>
@@ -33,7 +30,7 @@
         <w:jc w:val="center"/>
       </w:pPr>
       <w:r>
-        <w:t>Windows 10/11 · PySide6 · 5,000 ranked words · Six languages</w:t>
+        <w:t>Windows 10/11 · PySide6 · 5,000 ranked words · Seven languages · Eight options</w:t>
       </w:r>
     </w:p>
     <w:p>
@@ -57,7 +54,7 @@
         <w:spacing w:after="120" w:line="264" w:lineRule="auto"/>
       </w:pPr>
       <w:r>
-        <w:t>The approved revision expands the scope from verbs to the 5,000 most common words across all parts of speech. It supports US English, European Spanish, German, European Portuguese, French, and Italian. Extra forms adapt to each word type while every job remains capped at 5,000 final rows.</w:t>
+        <w:t>The approved revision covers the 5,000 most common words across all parts of speech. It supports US English, European Spanish, German, European Portuguese, French, Italian, Thai script, and tone-marked Paiboon romanization. Extra forms adapt to each word type while every job remains capped at 5,000 final rows.</w:t>
       </w:r>
     </w:p>
     <w:p>
@@ -115,7 +112,7 @@
         <w:ind w:left="720" w:hanging="360"/>
       </w:pPr>
       <w:r>
-        <w:t>Ship as a normal free Windows installer with its required runtime and FFmpeg files.</w:t>
+        <w:t>Ship as a normal free Windows installer with its required runtime and FFmpeg files. A globe rising from an open book is embedded as the native executable, installer, window, taskbar, Start menu, desktop shortcut, and uninstall icon; an explicit Windows AppUserModelID keeps the open-window card grouped correctly.</w:t>
       </w:r>
     </w:p>
     <w:p>
@@ -404,6 +401,70 @@
           <w:p>
             <w:r>
               <w:t>Formal standard Italian</w:t>
+            </w:r>
+          </w:p>
+        </w:tc>
+      </w:tr>
+      <w:tr>
+        <w:tc>
+          <w:tcPr>
+            <w:tcW w:type="dxa" w:w="1500"/>
+          </w:tcPr>
+          <w:p>
+            <w:r>
+              <w:t>th-Thai-TH</w:t>
+            </w:r>
+          </w:p>
+        </w:tc>
+        <w:tc>
+          <w:tcPr>
+            <w:tcW w:type="dxa" w:w="2600"/>
+          </w:tcPr>
+          <w:p>
+            <w:r>
+              <w:t>Thai (Thai script)</w:t>
+            </w:r>
+          </w:p>
+        </w:tc>
+        <w:tc>
+          <w:tcPr>
+            <w:tcW w:type="dxa" w:w="5260"/>
+          </w:tcPr>
+          <w:p>
+            <w:r>
+              <w:t>Formal standard Thai in Thai script</w:t>
+            </w:r>
+          </w:p>
+        </w:tc>
+      </w:tr>
+      <w:tr>
+        <w:tc>
+          <w:tcPr>
+            <w:tcW w:type="dxa" w:w="1500"/>
+          </w:tcPr>
+          <w:p>
+            <w:r>
+              <w:t>th-Latn-TH</w:t>
+            </w:r>
+          </w:p>
+        </w:tc>
+        <w:tc>
+          <w:tcPr>
+            <w:tcW w:type="dxa" w:w="2600"/>
+          </w:tcPr>
+          <w:p>
+            <w:r>
+              <w:t>Thai (Paiboon romanization)</w:t>
+            </w:r>
+          </w:p>
+        </w:tc>
+        <w:tc>
+          <w:tcPr>
+            <w:tcW w:type="dxa" w:w="5260"/>
+          </w:tcPr>
+          <w:p>
+            <w:r>
+              <w:t>Tone-marked Paiboon-style romanization of standard Thai</w:t>
             </w:r>
           </w:p>
         </w:tc>
@@ -1184,7 +1245,7 @@
         <w:ind w:left="720" w:hanging="360"/>
       </w:pPr>
       <w:r>
-        <w:t>Pronoun cadence: one person throughout, or change every 20, 10, 3, or 1 base rows.</w:t>
+        <w:t>Subject scale 0 keeps every row neutral or impersonal; values 1–4 assign exactly 20%, 40%, 60%, or 80% of final rows to personal subjects; value 5 changes the subject pattern on every consecutive row without an immediate repeat.</w:t>
       </w:r>
     </w:p>
     <w:p>
@@ -1352,7 +1413,7 @@
         <w:ind w:left="720" w:hanging="360"/>
       </w:pPr>
       <w:r>
-        <w:t>Use Microsoft Edge neural voices, including Italian voice discovery.</w:t>
+        <w:t>Use Microsoft Edge neural voices, including Italian and Thai voice discovery; both Thai display options map to the th-TH speech locale.</w:t>
       </w:r>
     </w:p>
     <w:p>
@@ -1454,7 +1515,7 @@
         <w:spacing w:after="120" w:line="264" w:lineRule="auto"/>
       </w:pPr>
       <w:r>
-        <w:t>The canonical production ranking is generated consistently for all six languages with wordfreq. Kaikki/Wiktionary provides lexical structure and forms. Secondary sources supplied for this project are used for automated comparison and anomaly reporting when their terms do not clearly permit redistribution.</w:t>
+        <w:t>The canonical production ranking uses wordfreq for the original six languages. Thai uses OpenSubtitles 2018 and the CC0 Phupha 2026 dataset; Kaikki/Wiktionary provides lexical validation and tone-marked Paiboon romanization. User-supplied lists remain comparison sources when their terms do not permit redistribution.</w:t>
       </w:r>
     </w:p>
     <w:tbl>
@@ -1672,6 +1733,28 @@
           </w:p>
         </w:tc>
       </w:tr>
+      <w:tr>
+        <w:tc>
+          <w:tcPr>
+            <w:tcW w:type="dxa" w:w="2500"/>
+          </w:tcPr>
+          <w:p>
+            <w:r>
+              <w:t>OpenSubtitles + Phupha</w:t>
+            </w:r>
+          </w:p>
+        </w:tc>
+        <w:tc>
+          <w:tcPr>
+            <w:tcW w:type="dxa" w:w="6860"/>
+          </w:tcPr>
+          <w:p>
+            <w:r>
+              <w:t>Canonical Thai rank evidence; CC BY-SA 4.0 and CC0 1.0 respectively</w:t>
+            </w:r>
+          </w:p>
+        </w:tc>
+      </w:tr>
     </w:tbl>
     <w:p>
       <w:pPr>
@@ -1706,7 +1789,7 @@
         <w:ind w:left="720" w:hanging="360"/>
       </w:pPr>
       <w:r>
-        <w:t>Generate a deterministic top order for every locale with wordfreq.</w:t>
+        <w:t>Generate the original six deterministic rankings with wordfreq; combine OpenSubtitles and Phupha deterministically for Thai.</w:t>
       </w:r>
     </w:p>
     <w:p>
@@ -1766,7 +1849,7 @@
         <w:ind w:left="720" w:hanging="360"/>
       </w:pPr>
       <w:r>
-        <w:t>Compile only `automated` rows and require 5,000 contiguous ranks for each of six languages.</w:t>
+        <w:t>Compile only `automated` rows and require 5,000 contiguous ranks for each of the eight language/script options.</w:t>
       </w:r>
     </w:p>
     <w:p>
@@ -2245,7 +2328,7 @@
           </w:tcPr>
           <w:p>
             <w:r>
-              <w:t>Six-language all-word schema and automated pipeline</w:t>
+              <w:t>Seven-language, eight-option all-word schema and pipeline</w:t>
             </w:r>
           </w:p>
         </w:tc>
@@ -2256,7 +2339,7 @@
           </w:tcPr>
           <w:p>
             <w:r>
-              <w:t>30,000 validated production records; reproducible audit</w:t>
+              <w:t>40,000 validated production records; reproducible audit</w:t>
             </w:r>
           </w:p>
         </w:tc>
@@ -2668,7 +2751,7 @@
           </w:tcPr>
           <w:p>
             <w:r>
-              <w:t>Dynamic maximum; notice; Italian; tabs/themes; worker states</w:t>
+              <w:t>Dynamic maximum; notice; Italian; both Thai options; native icon; tabs/themes; workers</w:t>
             </w:r>
           </w:p>
         </w:tc>
@@ -2738,7 +2821,7 @@
           </w:tcPr>
           <w:p>
             <w:r>
-              <w:t>Executable, installer, upgrade, uninstall, notices</w:t>
+              <w:t>Executable and installer icons; taskbar identity; upgrade; uninstall; notices</w:t>
             </w:r>
           </w:p>
         </w:tc>
@@ -2818,7 +2901,7 @@
         <w:ind w:left="720" w:hanging="360"/>
       </w:pPr>
       <w:r>
-        <w:t>All six corpora contain 5,000 entries with contiguous ranks, unique words, POS/form fallback, source, licence, and automated status.</w:t>
+        <w:t>All eight language/script corpora contain 5,000 entries with contiguous ranks, unique words, POS/form fallback, source, licence, and automated status; Thai script and Paiboon records are structurally distinct.</w:t>
       </w:r>
     </w:p>
     <w:p>
@@ -2876,7 +2959,7 @@
         <w:ind w:left="720" w:hanging="360"/>
       </w:pPr>
       <w:r>
-        <w:t>☒ Six languages and 30,000 production records pass the automated corpus gate.</w:t>
+        <w:t>☒ Seven languages, eight script options, and 40,000 production records pass the automated corpus gate.</w:t>
       </w:r>
     </w:p>
     <w:p>
@@ -2942,7 +3025,7 @@
         <w:spacing w:after="120" w:line="264" w:lineRule="auto"/>
       </w:pPr>
       <w:r>
-        <w:t>Version 1.0.0 is the completed production release. It includes the six-language all-word model, 5,000 ranked words per language, Italian, generalized forms, dynamic 5,000-row limits, neutral and controlled subject variation, resilient provider/TTS workflows, backward-compatible workbook import, and the verified Windows installer. Quality, Tests, corpus validation, clean Windows 10/11 acceptance, packaging, checksum, provenance, upgrade, uninstall, and user-data preservation gates are complete. Tag-driven GitHub release automation publishes the installer and portable archive; Authenticode signing remains automatic when the repository's protected certificate secrets are configured.</w:t>
+        <w:t>Version 1.1.0 is the completed Thai and Windows identity release. It includes eight language/script options, 40,000 ranked records, Thai script and tone-marked Paiboon romanization, Thai voice discovery, the globe-and-open-book logo, a native multi-size Windows icon, and explicit taskbar identity. Quality, Tests, corpus validation, clean Windows 10/11 acceptance, packaging, checksum, provenance, upgrade, uninstall, and user-data preservation gates are required. Tag-driven GitHub release automation publishes the installer and portable archive; Authenticode signing remains automatic when protected publisher certificate secrets are configured.</w:t>
       </w:r>
     </w:p>
     <w:sectPr>

</xml_diff>

<commit_message>
feat: add ranked workbook flashcards
</commit_message>
<xml_diff>
--- a/specs/Easy_Language_Learning_Tool_Project_Plan.docx
+++ b/specs/Easy_Language_Learning_Tool_Project_Plan.docx
@@ -22,7 +22,7 @@
         <w:jc w:val="center"/>
       </w:pPr>
       <w:r>
-        <w:t>Project Plan · Version 3.1 · Thai and Windows Identity Release</w:t>
+        <w:t>Project Plan · Version 4.0 · Ranked Flashcards and Input Safety RC</w:t>
       </w:r>
     </w:p>
     <w:p>
@@ -30,7 +30,7 @@
         <w:jc w:val="center"/>
       </w:pPr>
       <w:r>
-        <w:t>Windows 10/11 · PySide6 · 5,000 ranked words · Seven languages · Eight options</w:t>
+        <w:t>Windows 10/11 · PySide6 · 5,000 ranked words · Seven languages · Eight options · Four workflow tabs</w:t>
       </w:r>
     </w:p>
     <w:p>
@@ -46,7 +46,7 @@
         <w:spacing w:after="120" w:line="264" w:lineRule="auto"/>
       </w:pPr>
       <w:r>
-        <w:t>Easy Language Learning Tool is a Windows desktop application that creates structured language-learning sentence workbooks and converts them into natural-sounding, resumable MP3 lessons. The application selects study words deterministically from licensed frequency data; an AI provider writes and translates examples but never decides which words are most common.</w:t>
+        <w:t>Easy Language Learning Tool is a Windows desktop application that creates structured language-learning sentence workbooks, studies those workbooks as ranked flashcards, and converts them into natural-sounding, resumable MP3 lessons. The application selects study words deterministically from licensed frequency data; an AI provider writes and translates examples but never decides which words are most common.</w:t>
       </w:r>
     </w:p>
     <w:p>
@@ -1333,6 +1333,10 @@
     <w:p>
       <w:pPr>
         <w:pStyle w:val="ListNumber"/>
+        <w:numPr>
+          <w:ilvl w:val="0"/>
+          <w:numId w:val="10"/>
+        </w:numPr>
         <w:spacing w:after="160" w:line="280" w:lineRule="auto"/>
         <w:ind w:left="720" w:hanging="360"/>
       </w:pPr>
@@ -1343,6 +1347,10 @@
     <w:p>
       <w:pPr>
         <w:pStyle w:val="ListNumber"/>
+        <w:numPr>
+          <w:ilvl w:val="0"/>
+          <w:numId w:val="10"/>
+        </w:numPr>
         <w:spacing w:after="160" w:line="280" w:lineRule="auto"/>
         <w:ind w:left="720" w:hanging="360"/>
       </w:pPr>
@@ -1353,6 +1361,10 @@
     <w:p>
       <w:pPr>
         <w:pStyle w:val="ListNumber"/>
+        <w:numPr>
+          <w:ilvl w:val="0"/>
+          <w:numId w:val="10"/>
+        </w:numPr>
         <w:spacing w:after="160" w:line="280" w:lineRule="auto"/>
         <w:ind w:left="720" w:hanging="360"/>
       </w:pPr>
@@ -1363,6 +1375,10 @@
     <w:p>
       <w:pPr>
         <w:pStyle w:val="ListNumber"/>
+        <w:numPr>
+          <w:ilvl w:val="0"/>
+          <w:numId w:val="10"/>
+        </w:numPr>
         <w:spacing w:after="160" w:line="280" w:lineRule="auto"/>
         <w:ind w:left="720" w:hanging="360"/>
       </w:pPr>
@@ -1383,7 +1399,71 @@
         <w:pStyle w:val="Heading1"/>
       </w:pPr>
       <w:r>
-        <w:t>7. Text-to-Speech</w:t>
+        <w:t>7. Flashcards</w:t>
+      </w:r>
+    </w:p>
+    <w:p>
+      <w:pPr>
+        <w:pStyle w:val="Heading2"/>
+      </w:pPr>
+      <w:r>
+        <w:t>7.1 Workbook input and ranking</w:t>
+      </w:r>
+    </w:p>
+    <w:p>
+      <w:pPr/>
+      <w:r>
+        <w:t>Flashcards load an app-generated or schema-compatible `.xlsx` workbook without changing the source file. The first data row below the header is logical rank 1. Every logical rank and all four public cells are indexed in the local SQLite backend; the workbook frequency rank remains separate audit metadata.</w:t>
+      </w:r>
+    </w:p>
+    <w:p>
+      <w:pPr>
+        <w:pStyle w:val="Heading2"/>
+      </w:pPr>
+      <w:r>
+        <w:t>7.2 Card modes and layout</w:t>
+      </w:r>
+    </w:p>
+    <w:p>
+      <w:pPr/>
+      <w:r>
+        <w:t>Words shows the foreign word on the front and word translation on the back. Sentences uses the equivalent sentence pair. Words and sentences creates one combined card per workbook row, with the larger bold word above the sentence on both sides. Clicking the card or the Flip button changes sides.</w:t>
+      </w:r>
+    </w:p>
+    <w:p>
+      <w:pPr>
+        <w:pStyle w:val="Heading2"/>
+      </w:pPr>
+      <w:r>
+        <w:t>7.3 Selection, randomization, and recovery</w:t>
+      </w:r>
+    </w:p>
+    <w:p>
+      <w:pPr/>
+      <w:r>
+        <w:t>Selected rows only enables blank inclusive From rank and To rank fields; otherwise all rows are eligible. A study cycle is a random permutation, so no eligible row repeats before the selection is exhausted. Previous and Next preserve that order. Shuffle again starts a new cycle and avoids an immediate boundary repeat when more than one row is eligible. Workbook checksum, indexed rows, mode, range, order, position, and visible side resume across application restarts.</w:t>
+      </w:r>
+    </w:p>
+    <w:p>
+      <w:pPr>
+        <w:pStyle w:val="Heading2"/>
+      </w:pPr>
+      <w:r>
+        <w:t>7.4 Mouse-wheel input safety</w:t>
+      </w:r>
+    </w:p>
+    <w:p>
+      <w:pPr/>
+      <w:r>
+        <w:t>Dropdowns, numeric fields, and sliders change under the mouse wheel only after that exact control has been clicked. Unfocused controls leave wheel input available to the page scroll area. Focus loss disarms the field; open dropdowns and keyboard navigation remain available.</w:t>
+      </w:r>
+    </w:p>
+    <w:p>
+      <w:pPr>
+        <w:pStyle w:val="Heading1"/>
+      </w:pPr>
+      <w:r>
+        <w:t>8. Text-to-Speech</w:t>
       </w:r>
     </w:p>
     <w:p>
@@ -1451,7 +1531,7 @@
         <w:pStyle w:val="Heading1"/>
       </w:pPr>
       <w:r>
-        <w:t>8. History and local storage</w:t>
+        <w:t>9. History and local storage</w:t>
       </w:r>
     </w:p>
     <w:p>
@@ -1507,7 +1587,7 @@
         <w:pStyle w:val="Heading1"/>
       </w:pPr>
       <w:r>
-        <w:t>9. Corpus sources and licensing</w:t>
+        <w:t>10. Corpus sources and licensing</w:t>
       </w:r>
     </w:p>
     <w:p>
@@ -1769,12 +1849,16 @@
         <w:pStyle w:val="Heading1"/>
       </w:pPr>
       <w:r>
-        <w:t>10. Automated corpus pipeline</w:t>
+        <w:t>11. Automated corpus pipeline</w:t>
       </w:r>
     </w:p>
     <w:p>
       <w:pPr>
         <w:pStyle w:val="ListNumber"/>
+        <w:numPr>
+          <w:ilvl w:val="0"/>
+          <w:numId w:val="11"/>
+        </w:numPr>
         <w:spacing w:after="160" w:line="280" w:lineRule="auto"/>
         <w:ind w:left="720" w:hanging="360"/>
       </w:pPr>
@@ -1785,6 +1869,10 @@
     <w:p>
       <w:pPr>
         <w:pStyle w:val="ListNumber"/>
+        <w:numPr>
+          <w:ilvl w:val="0"/>
+          <w:numId w:val="11"/>
+        </w:numPr>
         <w:spacing w:after="160" w:line="280" w:lineRule="auto"/>
         <w:ind w:left="720" w:hanging="360"/>
       </w:pPr>
@@ -1795,6 +1883,10 @@
     <w:p>
       <w:pPr>
         <w:pStyle w:val="ListNumber"/>
+        <w:numPr>
+          <w:ilvl w:val="0"/>
+          <w:numId w:val="11"/>
+        </w:numPr>
         <w:spacing w:after="160" w:line="280" w:lineRule="auto"/>
         <w:ind w:left="720" w:hanging="360"/>
       </w:pPr>
@@ -1805,6 +1897,10 @@
     <w:p>
       <w:pPr>
         <w:pStyle w:val="ListNumber"/>
+        <w:numPr>
+          <w:ilvl w:val="0"/>
+          <w:numId w:val="11"/>
+        </w:numPr>
         <w:spacing w:after="160" w:line="280" w:lineRule="auto"/>
         <w:ind w:left="720" w:hanging="360"/>
       </w:pPr>
@@ -1815,6 +1911,10 @@
     <w:p>
       <w:pPr>
         <w:pStyle w:val="ListNumber"/>
+        <w:numPr>
+          <w:ilvl w:val="0"/>
+          <w:numId w:val="11"/>
+        </w:numPr>
         <w:spacing w:after="160" w:line="280" w:lineRule="auto"/>
         <w:ind w:left="720" w:hanging="360"/>
       </w:pPr>
@@ -1825,6 +1925,10 @@
     <w:p>
       <w:pPr>
         <w:pStyle w:val="ListNumber"/>
+        <w:numPr>
+          <w:ilvl w:val="0"/>
+          <w:numId w:val="11"/>
+        </w:numPr>
         <w:spacing w:after="160" w:line="280" w:lineRule="auto"/>
         <w:ind w:left="720" w:hanging="360"/>
       </w:pPr>
@@ -1835,6 +1939,10 @@
     <w:p>
       <w:pPr>
         <w:pStyle w:val="ListNumber"/>
+        <w:numPr>
+          <w:ilvl w:val="0"/>
+          <w:numId w:val="11"/>
+        </w:numPr>
         <w:spacing w:after="160" w:line="280" w:lineRule="auto"/>
         <w:ind w:left="720" w:hanging="360"/>
       </w:pPr>
@@ -1845,6 +1953,10 @@
     <w:p>
       <w:pPr>
         <w:pStyle w:val="ListNumber"/>
+        <w:numPr>
+          <w:ilvl w:val="0"/>
+          <w:numId w:val="11"/>
+        </w:numPr>
         <w:spacing w:after="160" w:line="280" w:lineRule="auto"/>
         <w:ind w:left="720" w:hanging="360"/>
       </w:pPr>
@@ -1857,7 +1969,7 @@
         <w:pStyle w:val="Heading1"/>
       </w:pPr>
       <w:r>
-        <w:t>11. Architecture and technology</w:t>
+        <w:t>12. Architecture and technology</w:t>
       </w:r>
     </w:p>
     <w:tbl>
@@ -2129,12 +2241,16 @@
         <w:pStyle w:val="Heading1"/>
       </w:pPr>
       <w:r>
-        <w:t>12. User workflow</w:t>
+        <w:t>13. User workflow</w:t>
       </w:r>
     </w:p>
     <w:p>
       <w:pPr>
         <w:pStyle w:val="ListNumber"/>
+        <w:numPr>
+          <w:ilvl w:val="0"/>
+          <w:numId w:val="12"/>
+        </w:numPr>
         <w:spacing w:after="160" w:line="280" w:lineRule="auto"/>
         <w:ind w:left="720" w:hanging="360"/>
       </w:pPr>
@@ -2145,6 +2261,10 @@
     <w:p>
       <w:pPr>
         <w:pStyle w:val="ListNumber"/>
+        <w:numPr>
+          <w:ilvl w:val="0"/>
+          <w:numId w:val="12"/>
+        </w:numPr>
         <w:spacing w:after="160" w:line="280" w:lineRule="auto"/>
         <w:ind w:left="720" w:hanging="360"/>
       </w:pPr>
@@ -2155,6 +2275,10 @@
     <w:p>
       <w:pPr>
         <w:pStyle w:val="ListNumber"/>
+        <w:numPr>
+          <w:ilvl w:val="0"/>
+          <w:numId w:val="12"/>
+        </w:numPr>
         <w:spacing w:after="160" w:line="280" w:lineRule="auto"/>
         <w:ind w:left="720" w:hanging="360"/>
       </w:pPr>
@@ -2165,6 +2289,10 @@
     <w:p>
       <w:pPr>
         <w:pStyle w:val="ListNumber"/>
+        <w:numPr>
+          <w:ilvl w:val="0"/>
+          <w:numId w:val="12"/>
+        </w:numPr>
         <w:spacing w:after="160" w:line="280" w:lineRule="auto"/>
         <w:ind w:left="720" w:hanging="360"/>
       </w:pPr>
@@ -2175,6 +2303,34 @@
     <w:p>
       <w:pPr>
         <w:pStyle w:val="ListNumber"/>
+        <w:numPr>
+          <w:ilvl w:val="0"/>
+          <w:numId w:val="12"/>
+        </w:numPr>
+      </w:pPr>
+      <w:r>
+        <w:t>Open Flashcards, load a History/import workbook, choose Words, Sentences, or both, and optionally apply an inclusive rank range.</w:t>
+      </w:r>
+    </w:p>
+    <w:p>
+      <w:pPr>
+        <w:pStyle w:val="ListNumber"/>
+        <w:numPr>
+          <w:ilvl w:val="0"/>
+          <w:numId w:val="12"/>
+        </w:numPr>
+      </w:pPr>
+      <w:r>
+        <w:t>Flip and navigate the stored random order; use Shuffle again only after finishing or when a fresh cycle is wanted.</w:t>
+      </w:r>
+    </w:p>
+    <w:p>
+      <w:pPr>
+        <w:pStyle w:val="ListNumber"/>
+        <w:numPr>
+          <w:ilvl w:val="0"/>
+          <w:numId w:val="12"/>
+        </w:numPr>
         <w:spacing w:after="160" w:line="280" w:lineRule="auto"/>
         <w:ind w:left="720" w:hanging="360"/>
       </w:pPr>
@@ -2185,6 +2341,10 @@
     <w:p>
       <w:pPr>
         <w:pStyle w:val="ListNumber"/>
+        <w:numPr>
+          <w:ilvl w:val="0"/>
+          <w:numId w:val="12"/>
+        </w:numPr>
         <w:spacing w:after="160" w:line="280" w:lineRule="auto"/>
         <w:ind w:left="720" w:hanging="360"/>
       </w:pPr>
@@ -2195,6 +2355,10 @@
     <w:p>
       <w:pPr>
         <w:pStyle w:val="ListNumber"/>
+        <w:numPr>
+          <w:ilvl w:val="0"/>
+          <w:numId w:val="12"/>
+        </w:numPr>
         <w:spacing w:after="160" w:line="280" w:lineRule="auto"/>
         <w:ind w:left="720" w:hanging="360"/>
       </w:pPr>
@@ -2207,7 +2371,7 @@
         <w:pStyle w:val="Heading1"/>
       </w:pPr>
       <w:r>
-        <w:t>13. Development phases and gates</w:t>
+        <w:t>14. Development phases and gates</w:t>
       </w:r>
     </w:p>
     <w:tbl>
@@ -2488,6 +2652,38 @@
         <w:tc>
           <w:tcPr>
             <w:tcW w:type="dxa" w:w="1500"/>
+          </w:tcPr>
+          <w:p>
+            <w:r>
+              <w:t>5A Flashcards</w:t>
+            </w:r>
+          </w:p>
+        </w:tc>
+        <w:tc>
+          <w:tcPr>
+            <w:tcW w:type="dxa" w:w="3900"/>
+          </w:tcPr>
+          <w:p>
+            <w:r>
+              <w:t>Ranked decks, persistence, range filtering, wheel safety</w:t>
+            </w:r>
+          </w:p>
+        </w:tc>
+        <w:tc>
+          <w:tcPr>
+            <w:tcW w:type="dxa" w:w="3960"/>
+          </w:tcPr>
+          <w:p>
+            <w:r>
+              <w:t>No-repeat cycles; resume and Windows UI tests pass</w:t>
+            </w:r>
+          </w:p>
+        </w:tc>
+      </w:tr>
+      <w:tr>
+        <w:tc>
+          <w:tcPr>
+            <w:tcW w:type="dxa" w:w="1500"/>
             <w:vAlign w:val="center"/>
           </w:tcPr>
           <w:p>
@@ -2525,7 +2721,7 @@
         <w:pStyle w:val="Heading1"/>
       </w:pPr>
       <w:r>
-        <w:t>14. Test strategy</w:t>
+        <w:t>15. Test strategy</w:t>
       </w:r>
     </w:p>
     <w:tbl>
@@ -2611,7 +2807,7 @@
           </w:tcPr>
           <w:p>
             <w:r>
-              <w:t>Row-limit matrix; allocation; normalization; POS/forms; validators</w:t>
+              <w:t>Row-limit matrix; allocation; normalization; POS/forms; flashcard permutations; validators</w:t>
             </w:r>
           </w:p>
         </w:tc>
@@ -2716,7 +2912,7 @@
           </w:tcPr>
           <w:p>
             <w:r>
-              <w:t>Generation resume; XLSX/CSV; SQLite; mocked TTS/FFmpeg</w:t>
+              <w:t>Generation resume; XLSX/CSV; ranked flashcard import/resume; SQLite; mocked TTS/FFmpeg</w:t>
             </w:r>
           </w:p>
         </w:tc>
@@ -2751,7 +2947,7 @@
           </w:tcPr>
           <w:p>
             <w:r>
-              <w:t>Dynamic maximum; notice; Italian; both Thai options; native icon; tabs/themes; workers</w:t>
+              <w:t>Dynamic maximum; flashcard modes/layout/ranges; wheel focus; languages; icon; tabs/themes</w:t>
             </w:r>
           </w:p>
         </w:tc>
@@ -2843,7 +3039,7 @@
         <w:pStyle w:val="Heading2"/>
       </w:pPr>
       <w:r>
-        <w:t>14.1 Locked row-boundary tests</w:t>
+        <w:t>15.1 Locked row-boundary tests</w:t>
       </w:r>
     </w:p>
     <w:p>
@@ -2891,7 +3087,7 @@
         <w:pStyle w:val="Heading2"/>
       </w:pPr>
       <w:r>
-        <w:t>14.2 Locked linguistic/structural tests</w:t>
+        <w:t>15.2 Locked linguistic/structural tests</w:t>
       </w:r>
     </w:p>
     <w:p>
@@ -2946,17 +3142,64 @@
     </w:p>
     <w:p>
       <w:pPr>
-        <w:pStyle w:val="Heading1"/>
+        <w:pStyle w:val="Heading2"/>
       </w:pPr>
       <w:r>
-        <w:t>15. Release acceptance</w:t>
+        <w:t>15.3 Locked flashcard and wheel tests</w:t>
       </w:r>
     </w:p>
     <w:p>
       <w:pPr>
         <w:pStyle w:val="ListBullet"/>
-        <w:spacing w:after="160" w:line="280" w:lineRule="auto"/>
-        <w:ind w:left="720" w:hanging="360"/>
+      </w:pPr>
+      <w:r>
+        <w:t>Workbook row 2 is rank 1; logical ranks remain continuous through the final nonblank data row.</w:t>
+      </w:r>
+    </w:p>
+    <w:p>
+      <w:pPr>
+        <w:pStyle w:val="ListBullet"/>
+      </w:pPr>
+      <w:r>
+        <w:t>Words, Sentences, and combined modes show the correct front/back cells; combined word text is larger and bold.</w:t>
+      </w:r>
+    </w:p>
+    <w:p>
+      <w:pPr>
+        <w:pStyle w:val="ListBullet"/>
+      </w:pPr>
+      <w:r>
+        <w:t>Inclusive full and partial ranges validate correctly; blank, reversed, zero, and over-limit ranges fail clearly.</w:t>
+      </w:r>
+    </w:p>
+    <w:p>
+      <w:pPr>
+        <w:pStyle w:val="ListBullet"/>
+      </w:pPr>
+      <w:r>
+        <w:t>Every eligible rank appears exactly once per cycle; navigation preserves order and restart restores all session state.</w:t>
+      </w:r>
+    </w:p>
+    <w:p>
+      <w:pPr>
+        <w:pStyle w:val="ListBullet"/>
+      </w:pPr>
+      <w:r>
+        <w:t>Unclicked dropdowns, numeric fields, and sliders remain unchanged while the containing page scrolls.</w:t>
+      </w:r>
+    </w:p>
+    <w:p>
+      <w:pPr>
+        <w:pStyle w:val="Heading1"/>
+      </w:pPr>
+      <w:r>
+        <w:t>16. Release acceptance</w:t>
+      </w:r>
+    </w:p>
+    <w:p>
+      <w:pPr>
+        <w:spacing w:after="80" w:line="280" w:lineRule="auto"/>
+        <w:ind w:left="360" w:firstLine="0"/>
       </w:pPr>
       <w:r>
         <w:t>☒ Seven languages, eight script options, and 40,000 production records pass the automated corpus gate.</w:t>
@@ -2964,9 +3207,8 @@
     </w:p>
     <w:p>
       <w:pPr>
-        <w:pStyle w:val="ListBullet"/>
-        <w:spacing w:after="160" w:line="280" w:lineRule="auto"/>
-        <w:ind w:left="720" w:hanging="360"/>
+        <w:spacing w:after="80" w:line="280" w:lineRule="auto"/>
+        <w:ind w:left="360" w:firstLine="0"/>
       </w:pPr>
       <w:r>
         <w:t>☒ No configuration exceeds 5,000 rows; POS-aware and invariant form paths pass.</w:t>
@@ -2974,9 +3216,8 @@
     </w:p>
     <w:p>
       <w:pPr>
-        <w:pStyle w:val="ListBullet"/>
-        <w:spacing w:after="160" w:line="280" w:lineRule="auto"/>
-        <w:ind w:left="720" w:hanging="360"/>
+        <w:spacing w:after="80" w:line="280" w:lineRule="auto"/>
+        <w:ind w:left="360" w:firstLine="0"/>
       </w:pPr>
       <w:r>
         <w:t>☒ All provider, generation, workbook, TTS recovery, history safety, UI, security, and performance gates pass.</w:t>
@@ -2984,9 +3225,8 @@
     </w:p>
     <w:p>
       <w:pPr>
-        <w:pStyle w:val="ListBullet"/>
-        <w:spacing w:after="160" w:line="280" w:lineRule="auto"/>
-        <w:ind w:left="720" w:hanging="360"/>
+        <w:spacing w:after="80" w:line="280" w:lineRule="auto"/>
+        <w:ind w:left="360" w:firstLine="0"/>
       </w:pPr>
       <w:r>
         <w:t>☒ Clean Windows 10/11 machines install and run without separate Python, Qt, or FFmpeg downloads.</w:t>
@@ -2994,9 +3234,8 @@
     </w:p>
     <w:p>
       <w:pPr>
-        <w:pStyle w:val="ListBullet"/>
-        <w:spacing w:after="160" w:line="280" w:lineRule="auto"/>
-        <w:ind w:left="720" w:hanging="360"/>
+        <w:spacing w:after="80" w:line="280" w:lineRule="auto"/>
+        <w:ind w:left="360" w:firstLine="0"/>
       </w:pPr>
       <w:r>
         <w:t>☒ README, source notices, licence inventory, release notes, checksum, and provenance are included.</w:t>
@@ -3004,9 +3243,8 @@
     </w:p>
     <w:p>
       <w:pPr>
-        <w:pStyle w:val="ListBullet"/>
-        <w:spacing w:after="160" w:line="280" w:lineRule="auto"/>
-        <w:ind w:left="720" w:hanging="360"/>
+        <w:spacing w:after="80" w:line="280" w:lineRule="auto"/>
+        <w:ind w:left="360" w:firstLine="0"/>
       </w:pPr>
       <w:r>
         <w:t>☒ No critical/high defect or failing required check remains; release automation applies Authenticode signing whenever protected publisher certificate secrets are configured.</w:t>
@@ -3014,10 +3252,19 @@
     </w:p>
     <w:p>
       <w:pPr>
+        <w:spacing w:after="80"/>
+        <w:ind w:left="360" w:firstLine="0"/>
+      </w:pPr>
+      <w:r>
+        <w:t>☐ v1.2.0 flashcard migration, restart recovery, wheel interaction, and Windows installer gates pass before release approval.</w:t>
+      </w:r>
+    </w:p>
+    <w:p>
+      <w:pPr>
         <w:pStyle w:val="Heading1"/>
       </w:pPr>
       <w:r>
-        <w:t>16. Current implementation status</w:t>
+        <w:t>17. Current implementation status</w:t>
       </w:r>
     </w:p>
     <w:p>
@@ -3025,7 +3272,7 @@
         <w:spacing w:after="120" w:line="264" w:lineRule="auto"/>
       </w:pPr>
       <w:r>
-        <w:t>Version 1.1.0 is the completed Thai and Windows identity release. It includes eight language/script options, 40,000 ranked records, Thai script and tone-marked Paiboon romanization, Thai voice discovery, the globe-and-open-book logo, a native multi-size Windows icon, and explicit taskbar identity. Quality, Tests, corpus validation, clean Windows 10/11 acceptance, packaging, checksum, provenance, upgrade, uninstall, and user-data preservation gates are required. Tag-driven GitHub release automation publishes the installer and portable archive; Authenticode signing remains automatic when protected publisher certificate secrets are configured.</w:t>
+        <w:t>Version 1.2.0 RC extends the completed v1.1.0 Thai and Windows identity release with ranked workbook flashcards, persistent study sessions, inclusive row filtering, and deliberate mouse-wheel focus. Development remains isolated from GitHub main and the published v1.1.0 installer. Quality, Tests, corpus validation, Windows UI, packaging, checksum, provenance, upgrade, uninstall, and user-data preservation gates are required before explicit approval, merge, or release publication.</w:t>
       </w:r>
     </w:p>
     <w:sectPr>
@@ -3257,6 +3504,24 @@
   </w:num>
   <w:num w:numId="9">
     <w:abstractNumId w:val="0"/>
+  </w:num>
+  <w:num w:numId="10">
+    <w:abstractNumId w:val="7"/>
+    <w:lvlOverride w:ilvl="0">
+      <w:startOverride w:val="1"/>
+    </w:lvlOverride>
+  </w:num>
+  <w:num w:numId="11">
+    <w:abstractNumId w:val="7"/>
+    <w:lvlOverride w:ilvl="0">
+      <w:startOverride w:val="1"/>
+    </w:lvlOverride>
+  </w:num>
+  <w:num w:numId="12">
+    <w:abstractNumId w:val="7"/>
+    <w:lvlOverride w:ilvl="0">
+      <w:startOverride w:val="1"/>
+    </w:lvlOverride>
   </w:num>
 </w:numbering>
 </file>

</xml_diff>

<commit_message>
feat: refine flashcards audio and wheel safety
</commit_message>
<xml_diff>
--- a/specs/Easy_Language_Learning_Tool_Project_Plan.docx
+++ b/specs/Easy_Language_Learning_Tool_Project_Plan.docx
@@ -22,7 +22,7 @@
         <w:jc w:val="center"/>
       </w:pPr>
       <w:r>
-        <w:t>Project Plan · Version 4.0 · Ranked Flashcards and Input Safety RC</w:t>
+        <w:t>Project Plan · Version 4.1 · Full-card Study, Reusable Audio and Strict Input Safety RC</w:t>
       </w:r>
     </w:p>
     <w:p>
@@ -1427,7 +1427,7 @@
     <w:p>
       <w:pPr/>
       <w:r>
-        <w:t>Words shows the foreign word on the front and word translation on the back. Sentences uses the equivalent sentence pair. Words and sentences creates one combined card per workbook row, with the larger bold word above the sentence on both sides. Clicking the card or the Flip button changes sides.</w:t>
+        <w:t>Words shows the foreign word on the front and word translation on the back. Sentences uses the equivalent sentence pair. Words and sentences creates one combined card per workbook row, with the larger bold word above the sentence on both sides. The quiet light/dark card expands to the available tab area beneath a compact control strip and shows only the study content, an accent divider, language-pair badge, progress, audio, and navigation—not side-name text bars. Clicking the card or Reveal changes sides. Flashcards and TTS each offer Load from History and Load from Desktop. Existing matching TTS cell clips are reused; missing visible-side clips are synthesized lazily, cached, and played word then sentence in combined mode without blocking the interface.</w:t>
       </w:r>
     </w:p>
     <w:p>
@@ -1455,7 +1455,7 @@
     <w:p>
       <w:pPr/>
       <w:r>
-        <w:t>Dropdowns, numeric fields, and sliders change under the mouse wheel only after that exact control has been clicked. Unfocused controls leave wheel input available to the page scroll area. Focus loss disarms the field; open dropdowns and keyboard navigation remain available.</w:t>
+        <w:t>Dropdowns, numeric fields, and sliders change under the mouse wheel only while that exact control has been clicked and still owns focus. Merely hovering—even over a previously used field—leaves wheel input available to the page scroll area. Focus loss disarms the field; open dropdowns and keyboard navigation remain available.</w:t>
       </w:r>
     </w:p>
     <w:p>
@@ -1473,7 +1473,7 @@
         <w:ind w:left="720" w:hanging="360"/>
       </w:pPr>
       <w:r>
-        <w:t>Import from History or any compatible `.xlsx` file; clearly label Language 1 as foreign and Language 2 as translation.</w:t>
+        <w:t>Provide separate Load from History and Load from Desktop actions; validate both through the same `.xlsx` contract and clearly label Language 1 as foreign and Language 2 as translation.</w:t>
       </w:r>
     </w:p>
     <w:p>
@@ -2665,7 +2665,7 @@
           </w:tcPr>
           <w:p>
             <w:r>
-              <w:t>Ranked decks, persistence, range filtering, wheel safety</w:t>
+              <w:t>Ranked decks, full-card layout, persistent audio, dual loaders, range filtering, strict wheel safety</w:t>
             </w:r>
           </w:p>
         </w:tc>
@@ -2675,7 +2675,7 @@
           </w:tcPr>
           <w:p>
             <w:r>
-              <w:t>No-repeat cycles; resume and Windows UI tests pass</w:t>
+              <w:t>No-repeat cycles; cache reuse; hover-wheel, resume, and Windows UI tests pass</w:t>
             </w:r>
           </w:p>
         </w:tc>
@@ -2947,7 +2947,7 @@
           </w:tcPr>
           <w:p>
             <w:r>
-              <w:t>Dynamic maximum; flashcard modes/layout/ranges; wheel focus; languages; icon; tabs/themes</w:t>
+              <w:t>Dynamic maximum; full-card modes/layout/ranges/audio; dual loaders; strict wheel focus; languages; icon; tabs/themes</w:t>
             </w:r>
           </w:p>
         </w:tc>
@@ -3161,7 +3161,7 @@
         <w:pStyle w:val="ListBullet"/>
       </w:pPr>
       <w:r>
-        <w:t>Words, Sentences, and combined modes show the correct front/back cells; combined word text is larger and bold.</w:t>
+        <w:t>Words, Sentences, and combined modes show the correct front/back cells; combined word text is larger and bold on a near-full-tab card with no side-name text bars.</w:t>
       </w:r>
     </w:p>
     <w:p>
@@ -3185,7 +3185,7 @@
         <w:pStyle w:val="ListBullet"/>
       </w:pPr>
       <w:r>
-        <w:t>Unclicked dropdowns, numeric fields, and sliders remain unchanged while the containing page scrolls.</w:t>
+        <w:t>Unclicked, unfocused, and merely hovered dropdowns, numeric fields, and sliders remain unchanged while the containing page scrolls; only the explicitly clicked focused field accepts wheel changes.</w:t>
       </w:r>
     </w:p>
     <w:p>
@@ -3272,7 +3272,7 @@
         <w:spacing w:after="120" w:line="264" w:lineRule="auto"/>
       </w:pPr>
       <w:r>
-        <w:t>Version 1.2.0 RC extends the completed v1.1.0 Thai and Windows identity release with ranked workbook flashcards, persistent study sessions, inclusive row filtering, and deliberate mouse-wheel focus. Development remains isolated from GitHub main and the published v1.1.0 installer. Quality, Tests, corpus validation, Windows UI, packaging, checksum, provenance, upgrade, uninstall, and user-data preservation gates are required before explicit approval, merge, or release publication.</w:t>
+        <w:t>Version 1.2.0 RC extends the completed v1.1.0 Thai and Windows identity release with ranked workbook flashcards, persistent study sessions, inclusive row filtering, a full-card light/dark study layout, History/Desktop loading, reusable lazy card audio, and strict clicked-plus-focused mouse-wheel input. Development remains isolated from GitHub main and the published v1.1.0 installer. Quality, Tests, corpus validation, Windows UI, packaging, checksum, provenance, upgrade, uninstall, and user-data preservation gates are required before explicit approval, merge, or release publication.</w:t>
       </w:r>
     </w:p>
     <w:sectPr>

</xml_diff>

<commit_message>
feat: add offline information guide
</commit_message>
<xml_diff>
--- a/specs/Easy_Language_Learning_Tool_Project_Plan.docx
+++ b/specs/Easy_Language_Learning_Tool_Project_Plan.docx
@@ -22,7 +22,7 @@
         <w:jc w:val="center"/>
       </w:pPr>
       <w:r>
-        <w:t>Project Plan · Version 4.1 · Full-card Study, Reusable Audio and Strict Input Safety RC</w:t>
+        <w:t>Project Plan · Version 4.2 · In-app Information Guide RC</w:t>
       </w:r>
     </w:p>
     <w:p>
@@ -30,7 +30,7 @@
         <w:jc w:val="center"/>
       </w:pPr>
       <w:r>
-        <w:t>Windows 10/11 · PySide6 · 5,000 ranked words · Seven languages · Eight options · Four workflow tabs</w:t>
+        <w:t>Windows 10/11 · PySide6 · 5,000 ranked words · Seven languages · Eight options · Five workflow tabs</w:t>
       </w:r>
     </w:p>
     <w:p>
@@ -1427,7 +1427,7 @@
     <w:p>
       <w:pPr/>
       <w:r>
-        <w:t>Words shows the foreign word on the front and word translation on the back. Sentences uses the equivalent sentence pair. Words and sentences creates one combined card per workbook row, with the larger bold word above the sentence on both sides. The quiet light/dark card expands to the available tab area beneath a compact control strip and shows only the study content, an accent divider, language-pair badge, progress, audio, and navigation—not side-name text bars. Clicking the card or Reveal changes sides. Flashcards and TTS each offer Load from History and Load from Desktop. Existing matching TTS cell clips are reused; missing visible-side clips are synthesized lazily, cached, and played word then sentence in combined mode without blocking the interface.</w:t>
+        <w:t>Words shows the foreign word on the front and word translation on the back. Sentences uses the equivalent sentence pair. Words and sentences creates one combined card per workbook row, with the larger bold word above the sentence on both sides. The quiet light/dark card expands to the available tab area beneath a compact control strip and shows only the study content, language-pair badge, progress, audio, and navigation—not side-name text bars. Clicking the card or Reveal changes sides. Flashcards and TTS each offer Load from History and Load from Desktop. Existing matching TTS cell clips are reused; missing visible-side clips are synthesized lazily, cached, and played word then sentence in combined mode without blocking the interface.</w:t>
       </w:r>
     </w:p>
     <w:p>
@@ -1455,7 +1455,7 @@
     <w:p>
       <w:pPr/>
       <w:r>
-        <w:t>Dropdowns, numeric fields, and sliders change under the mouse wheel only while that exact control has been clicked and still owns focus. Merely hovering—even over a previously used field—leaves wheel input available to the page scroll area. Focus loss disarms the field; open dropdowns and keyboard navigation remain available.</w:t>
+        <w:t>Dropdowns, numeric fields, and sliders never change from mouse-wheel input, whether hovered, focused, or previously clicked. Wheel input remains available to the page scroll area. Values change only through explicit choices, arrows, dragging, or keyboard input.</w:t>
       </w:r>
     </w:p>
     <w:p>
@@ -1580,6 +1580,20 @@
       </w:pPr>
       <w:r>
         <w:t>Regenerate preserves the original, restores its settings, uses a new seed, and creates a new output.</w:t>
+      </w:r>
+    </w:p>
+    <w:p>
+      <w:pPr>
+        <w:pStyle w:val="Heading2"/>
+      </w:pPr>
+      <w:r>
+        <w:t>9.1 Information page</w:t>
+      </w:r>
+    </w:p>
+    <w:p>
+      <w:pPr/>
+      <w:r>
+        <w:t>A fifth Information tab appears immediately after History. It loads the complete bundled operating guide without requiring internet access, begins at section 1, covers Sentence Creation, Flashcards, Text to Speech, History, connectivity, and troubleshooting, and opens external links in the system browser.</w:t>
       </w:r>
     </w:p>
     <w:p>
@@ -2368,6 +2382,14 @@
     </w:p>
     <w:p>
       <w:pPr>
+        <w:pStyle w:val="ListNumber"/>
+      </w:pPr>
+      <w:r>
+        <w:t>Open Information for the complete offline operating guide and troubleshooting reference.</w:t>
+      </w:r>
+    </w:p>
+    <w:p>
+      <w:pPr>
         <w:pStyle w:val="Heading1"/>
       </w:pPr>
       <w:r>
@@ -2655,7 +2677,7 @@
           </w:tcPr>
           <w:p>
             <w:r>
-              <w:t>5A Flashcards</w:t>
+              <w:t>5A Flashcards/UI</w:t>
             </w:r>
           </w:p>
         </w:tc>
@@ -2665,7 +2687,7 @@
           </w:tcPr>
           <w:p>
             <w:r>
-              <w:t>Ranked decks, full-card layout, persistent audio, dual loaders, range filtering, strict wheel safety</w:t>
+              <w:t>Ranked decks, full-card layout, persistent audio, dual loaders, range filtering, strict wheel safety, offline Information guide</w:t>
             </w:r>
           </w:p>
         </w:tc>
@@ -2675,7 +2697,7 @@
           </w:tcPr>
           <w:p>
             <w:r>
-              <w:t>No-repeat cycles; cache reuse; hover-wheel, resume, and Windows UI tests pass</w:t>
+              <w:t>No-repeat cycles; cache reuse; hover-wheel, resume, manual, and Windows UI tests pass</w:t>
             </w:r>
           </w:p>
         </w:tc>
@@ -2947,7 +2969,7 @@
           </w:tcPr>
           <w:p>
             <w:r>
-              <w:t>Dynamic maximum; full-card modes/layout/ranges/audio; dual loaders; strict wheel focus; languages; icon; tabs/themes</w:t>
+              <w:t>Dynamic maximum; full-card modes/layout/ranges/audio; dual loaders; wheel safety; languages; icon; five tabs/themes; embedded manual</w:t>
             </w:r>
           </w:p>
         </w:tc>
@@ -3185,7 +3207,7 @@
         <w:pStyle w:val="ListBullet"/>
       </w:pPr>
       <w:r>
-        <w:t>Unclicked, unfocused, and merely hovered dropdowns, numeric fields, and sliders remain unchanged while the containing page scrolls; only the explicitly clicked focused field accepts wheel changes.</w:t>
+        <w:t>Hovered, focused, and previously clicked dropdowns, numeric fields, and sliders remain unchanged while the containing page scrolls; values change only through explicit controls or keyboard input.</w:t>
       </w:r>
     </w:p>
     <w:p>
@@ -3256,7 +3278,7 @@
         <w:ind w:left="360" w:firstLine="0"/>
       </w:pPr>
       <w:r>
-        <w:t>☐ v1.2.0 flashcard migration, restart recovery, wheel interaction, and Windows installer gates pass before release approval.</w:t>
+        <w:t>☐ v1.3.0 Information guide, flashcard migration, restart recovery, wheel interaction, and Windows installer gates pass before release approval.</w:t>
       </w:r>
     </w:p>
     <w:p>
@@ -3272,7 +3294,7 @@
         <w:spacing w:after="120" w:line="264" w:lineRule="auto"/>
       </w:pPr>
       <w:r>
-        <w:t>Version 1.2.0 RC extends the completed v1.1.0 Thai and Windows identity release with ranked workbook flashcards, persistent study sessions, inclusive row filtering, a full-card light/dark study layout, History/Desktop loading, reusable lazy card audio, and strict clicked-plus-focused mouse-wheel input. Development remains isolated from GitHub main and the published v1.1.0 installer. Quality, Tests, corpus validation, Windows UI, packaging, checksum, provenance, upgrade, uninstall, and user-data preservation gates are required before explicit approval, merge, or release publication.</w:t>
+        <w:t>Version 1.3.0 RC extends the completed v1.1.0 Thai and Windows identity release with ranked workbook flashcards, persistent study sessions, inclusive row filtering, a full-card light/dark study layout, History/Desktop loading, reusable lazy card audio, strict mouse-wheel input safety, and an offline Information page containing the complete numbered operating guide. Development remains isolated from GitHub main and the published v1.1.0 installer. Quality, Tests, corpus validation, Windows UI, packaged-manual, checksum, provenance, upgrade, uninstall, and user-data preservation gates are required before explicit approval, merge, or release publication.</w:t>
       </w:r>
     </w:p>
     <w:sectPr>

</xml_diff>

<commit_message>
Easy Language Learning Tool 1.3.0
Publish ranked flashcards, hardened audio replay and wheel controls, the in-app Information guide, the complete README manual, and the v1.3.0 installer link.
</commit_message>
<xml_diff>
--- a/specs/Easy_Language_Learning_Tool_Project_Plan.docx
+++ b/specs/Easy_Language_Learning_Tool_Project_Plan.docx
@@ -22,7 +22,7 @@
         <w:jc w:val="center"/>
       </w:pPr>
       <w:r>
-        <w:t>Project Plan · Version 3.1 · Thai and Windows Identity Release</w:t>
+        <w:t>Project Plan · Version 4.2 · In-app Information Guide RC</w:t>
       </w:r>
     </w:p>
     <w:p>
@@ -30,7 +30,7 @@
         <w:jc w:val="center"/>
       </w:pPr>
       <w:r>
-        <w:t>Windows 10/11 · PySide6 · 5,000 ranked words · Seven languages · Eight options</w:t>
+        <w:t>Windows 10/11 · PySide6 · 5,000 ranked words · Seven languages · Eight options · Five workflow tabs</w:t>
       </w:r>
     </w:p>
     <w:p>
@@ -46,7 +46,7 @@
         <w:spacing w:after="120" w:line="264" w:lineRule="auto"/>
       </w:pPr>
       <w:r>
-        <w:t>Easy Language Learning Tool is a Windows desktop application that creates structured language-learning sentence workbooks and converts them into natural-sounding, resumable MP3 lessons. The application selects study words deterministically from licensed frequency data; an AI provider writes and translates examples but never decides which words are most common.</w:t>
+        <w:t>Easy Language Learning Tool is a Windows desktop application that creates structured language-learning sentence workbooks, studies those workbooks as ranked flashcards, and converts them into natural-sounding, resumable MP3 lessons. The application selects study words deterministically from licensed frequency data; an AI provider writes and translates examples but never decides which words are most common.</w:t>
       </w:r>
     </w:p>
     <w:p>
@@ -1333,6 +1333,10 @@
     <w:p>
       <w:pPr>
         <w:pStyle w:val="ListNumber"/>
+        <w:numPr>
+          <w:ilvl w:val="0"/>
+          <w:numId w:val="10"/>
+        </w:numPr>
         <w:spacing w:after="160" w:line="280" w:lineRule="auto"/>
         <w:ind w:left="720" w:hanging="360"/>
       </w:pPr>
@@ -1343,6 +1347,10 @@
     <w:p>
       <w:pPr>
         <w:pStyle w:val="ListNumber"/>
+        <w:numPr>
+          <w:ilvl w:val="0"/>
+          <w:numId w:val="10"/>
+        </w:numPr>
         <w:spacing w:after="160" w:line="280" w:lineRule="auto"/>
         <w:ind w:left="720" w:hanging="360"/>
       </w:pPr>
@@ -1353,6 +1361,10 @@
     <w:p>
       <w:pPr>
         <w:pStyle w:val="ListNumber"/>
+        <w:numPr>
+          <w:ilvl w:val="0"/>
+          <w:numId w:val="10"/>
+        </w:numPr>
         <w:spacing w:after="160" w:line="280" w:lineRule="auto"/>
         <w:ind w:left="720" w:hanging="360"/>
       </w:pPr>
@@ -1363,6 +1375,10 @@
     <w:p>
       <w:pPr>
         <w:pStyle w:val="ListNumber"/>
+        <w:numPr>
+          <w:ilvl w:val="0"/>
+          <w:numId w:val="10"/>
+        </w:numPr>
         <w:spacing w:after="160" w:line="280" w:lineRule="auto"/>
         <w:ind w:left="720" w:hanging="360"/>
       </w:pPr>
@@ -1383,7 +1399,71 @@
         <w:pStyle w:val="Heading1"/>
       </w:pPr>
       <w:r>
-        <w:t>7. Text-to-Speech</w:t>
+        <w:t>7. Flashcards</w:t>
+      </w:r>
+    </w:p>
+    <w:p>
+      <w:pPr>
+        <w:pStyle w:val="Heading2"/>
+      </w:pPr>
+      <w:r>
+        <w:t>7.1 Workbook input and ranking</w:t>
+      </w:r>
+    </w:p>
+    <w:p>
+      <w:pPr/>
+      <w:r>
+        <w:t>Flashcards load an app-generated or schema-compatible `.xlsx` workbook without changing the source file. The first data row below the header is logical rank 1. Every logical rank and all four public cells are indexed in the local SQLite backend; the workbook frequency rank remains separate audit metadata.</w:t>
+      </w:r>
+    </w:p>
+    <w:p>
+      <w:pPr>
+        <w:pStyle w:val="Heading2"/>
+      </w:pPr>
+      <w:r>
+        <w:t>7.2 Card modes and layout</w:t>
+      </w:r>
+    </w:p>
+    <w:p>
+      <w:pPr/>
+      <w:r>
+        <w:t>Words shows the foreign word on the front and word translation on the back. Sentences uses the equivalent sentence pair. Words and sentences creates one combined card per workbook row, with the larger bold word above the sentence on both sides. The quiet light/dark card expands to the available tab area beneath a compact control strip and shows only the study content, language-pair badge, progress, audio, and navigation—not side-name text bars. Clicking the card or Reveal changes sides. Flashcards and TTS each offer Load from History and Load from Desktop. Existing matching TTS cell clips are reused; missing visible-side clips are synthesized lazily, cached, and played word then sentence in combined mode without blocking the interface.</w:t>
+      </w:r>
+    </w:p>
+    <w:p>
+      <w:pPr>
+        <w:pStyle w:val="Heading2"/>
+      </w:pPr>
+      <w:r>
+        <w:t>7.3 Selection, randomization, and recovery</w:t>
+      </w:r>
+    </w:p>
+    <w:p>
+      <w:pPr/>
+      <w:r>
+        <w:t>Selected rows only enables blank inclusive From rank and To rank fields; otherwise all rows are eligible. A study cycle is a random permutation, so no eligible row repeats before the selection is exhausted. Previous and Next preserve that order. Shuffle again starts a new cycle and avoids an immediate boundary repeat when more than one row is eligible. Workbook checksum, indexed rows, mode, range, order, position, and visible side resume across application restarts.</w:t>
+      </w:r>
+    </w:p>
+    <w:p>
+      <w:pPr>
+        <w:pStyle w:val="Heading2"/>
+      </w:pPr>
+      <w:r>
+        <w:t>7.4 Mouse-wheel input safety</w:t>
+      </w:r>
+    </w:p>
+    <w:p>
+      <w:pPr/>
+      <w:r>
+        <w:t>Dropdowns, numeric fields, and sliders never change from mouse-wheel input, whether hovered, focused, or previously clicked. Wheel input remains available to the page scroll area. Values change only through explicit choices, arrows, dragging, or keyboard input.</w:t>
+      </w:r>
+    </w:p>
+    <w:p>
+      <w:pPr>
+        <w:pStyle w:val="Heading1"/>
+      </w:pPr>
+      <w:r>
+        <w:t>8. Text-to-Speech</w:t>
       </w:r>
     </w:p>
     <w:p>
@@ -1393,7 +1473,7 @@
         <w:ind w:left="720" w:hanging="360"/>
       </w:pPr>
       <w:r>
-        <w:t>Import from History or any compatible `.xlsx` file; clearly label Language 1 as foreign and Language 2 as translation.</w:t>
+        <w:t>Provide separate Load from History and Load from Desktop actions; validate both through the same `.xlsx` contract and clearly label Language 1 as foreign and Language 2 as translation.</w:t>
       </w:r>
     </w:p>
     <w:p>
@@ -1451,7 +1531,7 @@
         <w:pStyle w:val="Heading1"/>
       </w:pPr>
       <w:r>
-        <w:t>8. History and local storage</w:t>
+        <w:t>9. History and local storage</w:t>
       </w:r>
     </w:p>
     <w:p>
@@ -1504,10 +1584,24 @@
     </w:p>
     <w:p>
       <w:pPr>
+        <w:pStyle w:val="Heading2"/>
+      </w:pPr>
+      <w:r>
+        <w:t>9.1 Information page</w:t>
+      </w:r>
+    </w:p>
+    <w:p>
+      <w:pPr/>
+      <w:r>
+        <w:t>A fifth Information tab appears immediately after History. It loads the complete bundled operating guide without requiring internet access, begins at section 1, covers Sentence Creation, Flashcards, Text to Speech, History, connectivity, and troubleshooting, and opens external links in the system browser.</w:t>
+      </w:r>
+    </w:p>
+    <w:p>
+      <w:pPr>
         <w:pStyle w:val="Heading1"/>
       </w:pPr>
       <w:r>
-        <w:t>9. Corpus sources and licensing</w:t>
+        <w:t>10. Corpus sources and licensing</w:t>
       </w:r>
     </w:p>
     <w:p>
@@ -1769,12 +1863,16 @@
         <w:pStyle w:val="Heading1"/>
       </w:pPr>
       <w:r>
-        <w:t>10. Automated corpus pipeline</w:t>
+        <w:t>11. Automated corpus pipeline</w:t>
       </w:r>
     </w:p>
     <w:p>
       <w:pPr>
         <w:pStyle w:val="ListNumber"/>
+        <w:numPr>
+          <w:ilvl w:val="0"/>
+          <w:numId w:val="11"/>
+        </w:numPr>
         <w:spacing w:after="160" w:line="280" w:lineRule="auto"/>
         <w:ind w:left="720" w:hanging="360"/>
       </w:pPr>
@@ -1785,6 +1883,10 @@
     <w:p>
       <w:pPr>
         <w:pStyle w:val="ListNumber"/>
+        <w:numPr>
+          <w:ilvl w:val="0"/>
+          <w:numId w:val="11"/>
+        </w:numPr>
         <w:spacing w:after="160" w:line="280" w:lineRule="auto"/>
         <w:ind w:left="720" w:hanging="360"/>
       </w:pPr>
@@ -1795,6 +1897,10 @@
     <w:p>
       <w:pPr>
         <w:pStyle w:val="ListNumber"/>
+        <w:numPr>
+          <w:ilvl w:val="0"/>
+          <w:numId w:val="11"/>
+        </w:numPr>
         <w:spacing w:after="160" w:line="280" w:lineRule="auto"/>
         <w:ind w:left="720" w:hanging="360"/>
       </w:pPr>
@@ -1805,6 +1911,10 @@
     <w:p>
       <w:pPr>
         <w:pStyle w:val="ListNumber"/>
+        <w:numPr>
+          <w:ilvl w:val="0"/>
+          <w:numId w:val="11"/>
+        </w:numPr>
         <w:spacing w:after="160" w:line="280" w:lineRule="auto"/>
         <w:ind w:left="720" w:hanging="360"/>
       </w:pPr>
@@ -1815,6 +1925,10 @@
     <w:p>
       <w:pPr>
         <w:pStyle w:val="ListNumber"/>
+        <w:numPr>
+          <w:ilvl w:val="0"/>
+          <w:numId w:val="11"/>
+        </w:numPr>
         <w:spacing w:after="160" w:line="280" w:lineRule="auto"/>
         <w:ind w:left="720" w:hanging="360"/>
       </w:pPr>
@@ -1825,6 +1939,10 @@
     <w:p>
       <w:pPr>
         <w:pStyle w:val="ListNumber"/>
+        <w:numPr>
+          <w:ilvl w:val="0"/>
+          <w:numId w:val="11"/>
+        </w:numPr>
         <w:spacing w:after="160" w:line="280" w:lineRule="auto"/>
         <w:ind w:left="720" w:hanging="360"/>
       </w:pPr>
@@ -1835,6 +1953,10 @@
     <w:p>
       <w:pPr>
         <w:pStyle w:val="ListNumber"/>
+        <w:numPr>
+          <w:ilvl w:val="0"/>
+          <w:numId w:val="11"/>
+        </w:numPr>
         <w:spacing w:after="160" w:line="280" w:lineRule="auto"/>
         <w:ind w:left="720" w:hanging="360"/>
       </w:pPr>
@@ -1845,6 +1967,10 @@
     <w:p>
       <w:pPr>
         <w:pStyle w:val="ListNumber"/>
+        <w:numPr>
+          <w:ilvl w:val="0"/>
+          <w:numId w:val="11"/>
+        </w:numPr>
         <w:spacing w:after="160" w:line="280" w:lineRule="auto"/>
         <w:ind w:left="720" w:hanging="360"/>
       </w:pPr>
@@ -1857,7 +1983,7 @@
         <w:pStyle w:val="Heading1"/>
       </w:pPr>
       <w:r>
-        <w:t>11. Architecture and technology</w:t>
+        <w:t>12. Architecture and technology</w:t>
       </w:r>
     </w:p>
     <w:tbl>
@@ -2129,12 +2255,16 @@
         <w:pStyle w:val="Heading1"/>
       </w:pPr>
       <w:r>
-        <w:t>12. User workflow</w:t>
+        <w:t>13. User workflow</w:t>
       </w:r>
     </w:p>
     <w:p>
       <w:pPr>
         <w:pStyle w:val="ListNumber"/>
+        <w:numPr>
+          <w:ilvl w:val="0"/>
+          <w:numId w:val="12"/>
+        </w:numPr>
         <w:spacing w:after="160" w:line="280" w:lineRule="auto"/>
         <w:ind w:left="720" w:hanging="360"/>
       </w:pPr>
@@ -2145,6 +2275,10 @@
     <w:p>
       <w:pPr>
         <w:pStyle w:val="ListNumber"/>
+        <w:numPr>
+          <w:ilvl w:val="0"/>
+          <w:numId w:val="12"/>
+        </w:numPr>
         <w:spacing w:after="160" w:line="280" w:lineRule="auto"/>
         <w:ind w:left="720" w:hanging="360"/>
       </w:pPr>
@@ -2155,6 +2289,10 @@
     <w:p>
       <w:pPr>
         <w:pStyle w:val="ListNumber"/>
+        <w:numPr>
+          <w:ilvl w:val="0"/>
+          <w:numId w:val="12"/>
+        </w:numPr>
         <w:spacing w:after="160" w:line="280" w:lineRule="auto"/>
         <w:ind w:left="720" w:hanging="360"/>
       </w:pPr>
@@ -2165,6 +2303,10 @@
     <w:p>
       <w:pPr>
         <w:pStyle w:val="ListNumber"/>
+        <w:numPr>
+          <w:ilvl w:val="0"/>
+          <w:numId w:val="12"/>
+        </w:numPr>
         <w:spacing w:after="160" w:line="280" w:lineRule="auto"/>
         <w:ind w:left="720" w:hanging="360"/>
       </w:pPr>
@@ -2175,6 +2317,34 @@
     <w:p>
       <w:pPr>
         <w:pStyle w:val="ListNumber"/>
+        <w:numPr>
+          <w:ilvl w:val="0"/>
+          <w:numId w:val="12"/>
+        </w:numPr>
+      </w:pPr>
+      <w:r>
+        <w:t>Open Flashcards, load a History/import workbook, choose Words, Sentences, or both, and optionally apply an inclusive rank range.</w:t>
+      </w:r>
+    </w:p>
+    <w:p>
+      <w:pPr>
+        <w:pStyle w:val="ListNumber"/>
+        <w:numPr>
+          <w:ilvl w:val="0"/>
+          <w:numId w:val="12"/>
+        </w:numPr>
+      </w:pPr>
+      <w:r>
+        <w:t>Flip and navigate the stored random order; use Shuffle again only after finishing or when a fresh cycle is wanted.</w:t>
+      </w:r>
+    </w:p>
+    <w:p>
+      <w:pPr>
+        <w:pStyle w:val="ListNumber"/>
+        <w:numPr>
+          <w:ilvl w:val="0"/>
+          <w:numId w:val="12"/>
+        </w:numPr>
         <w:spacing w:after="160" w:line="280" w:lineRule="auto"/>
         <w:ind w:left="720" w:hanging="360"/>
       </w:pPr>
@@ -2185,6 +2355,10 @@
     <w:p>
       <w:pPr>
         <w:pStyle w:val="ListNumber"/>
+        <w:numPr>
+          <w:ilvl w:val="0"/>
+          <w:numId w:val="12"/>
+        </w:numPr>
         <w:spacing w:after="160" w:line="280" w:lineRule="auto"/>
         <w:ind w:left="720" w:hanging="360"/>
       </w:pPr>
@@ -2195,6 +2369,10 @@
     <w:p>
       <w:pPr>
         <w:pStyle w:val="ListNumber"/>
+        <w:numPr>
+          <w:ilvl w:val="0"/>
+          <w:numId w:val="12"/>
+        </w:numPr>
         <w:spacing w:after="160" w:line="280" w:lineRule="auto"/>
         <w:ind w:left="720" w:hanging="360"/>
       </w:pPr>
@@ -2204,10 +2382,18 @@
     </w:p>
     <w:p>
       <w:pPr>
+        <w:pStyle w:val="ListNumber"/>
+      </w:pPr>
+      <w:r>
+        <w:t>Open Information for the complete offline operating guide and troubleshooting reference.</w:t>
+      </w:r>
+    </w:p>
+    <w:p>
+      <w:pPr>
         <w:pStyle w:val="Heading1"/>
       </w:pPr>
       <w:r>
-        <w:t>13. Development phases and gates</w:t>
+        <w:t>14. Development phases and gates</w:t>
       </w:r>
     </w:p>
     <w:tbl>
@@ -2488,6 +2674,38 @@
         <w:tc>
           <w:tcPr>
             <w:tcW w:type="dxa" w:w="1500"/>
+          </w:tcPr>
+          <w:p>
+            <w:r>
+              <w:t>5A Flashcards/UI</w:t>
+            </w:r>
+          </w:p>
+        </w:tc>
+        <w:tc>
+          <w:tcPr>
+            <w:tcW w:type="dxa" w:w="3900"/>
+          </w:tcPr>
+          <w:p>
+            <w:r>
+              <w:t>Ranked decks, full-card layout, persistent audio, dual loaders, range filtering, strict wheel safety, offline Information guide</w:t>
+            </w:r>
+          </w:p>
+        </w:tc>
+        <w:tc>
+          <w:tcPr>
+            <w:tcW w:type="dxa" w:w="3960"/>
+          </w:tcPr>
+          <w:p>
+            <w:r>
+              <w:t>No-repeat cycles; cache reuse; hover-wheel, resume, manual, and Windows UI tests pass</w:t>
+            </w:r>
+          </w:p>
+        </w:tc>
+      </w:tr>
+      <w:tr>
+        <w:tc>
+          <w:tcPr>
+            <w:tcW w:type="dxa" w:w="1500"/>
             <w:vAlign w:val="center"/>
           </w:tcPr>
           <w:p>
@@ -2525,7 +2743,7 @@
         <w:pStyle w:val="Heading1"/>
       </w:pPr>
       <w:r>
-        <w:t>14. Test strategy</w:t>
+        <w:t>15. Test strategy</w:t>
       </w:r>
     </w:p>
     <w:tbl>
@@ -2611,7 +2829,7 @@
           </w:tcPr>
           <w:p>
             <w:r>
-              <w:t>Row-limit matrix; allocation; normalization; POS/forms; validators</w:t>
+              <w:t>Row-limit matrix; allocation; normalization; POS/forms; flashcard permutations; validators</w:t>
             </w:r>
           </w:p>
         </w:tc>
@@ -2716,7 +2934,7 @@
           </w:tcPr>
           <w:p>
             <w:r>
-              <w:t>Generation resume; XLSX/CSV; SQLite; mocked TTS/FFmpeg</w:t>
+              <w:t>Generation resume; XLSX/CSV; ranked flashcard import/resume; SQLite; mocked TTS/FFmpeg</w:t>
             </w:r>
           </w:p>
         </w:tc>
@@ -2751,7 +2969,7 @@
           </w:tcPr>
           <w:p>
             <w:r>
-              <w:t>Dynamic maximum; notice; Italian; both Thai options; native icon; tabs/themes; workers</w:t>
+              <w:t>Dynamic maximum; full-card modes/layout/ranges/audio; dual loaders; wheel safety; languages; icon; five tabs/themes; embedded manual</w:t>
             </w:r>
           </w:p>
         </w:tc>
@@ -2843,7 +3061,7 @@
         <w:pStyle w:val="Heading2"/>
       </w:pPr>
       <w:r>
-        <w:t>14.1 Locked row-boundary tests</w:t>
+        <w:t>15.1 Locked row-boundary tests</w:t>
       </w:r>
     </w:p>
     <w:p>
@@ -2891,7 +3109,7 @@
         <w:pStyle w:val="Heading2"/>
       </w:pPr>
       <w:r>
-        <w:t>14.2 Locked linguistic/structural tests</w:t>
+        <w:t>15.2 Locked linguistic/structural tests</w:t>
       </w:r>
     </w:p>
     <w:p>
@@ -2946,17 +3164,64 @@
     </w:p>
     <w:p>
       <w:pPr>
-        <w:pStyle w:val="Heading1"/>
+        <w:pStyle w:val="Heading2"/>
       </w:pPr>
       <w:r>
-        <w:t>15. Release acceptance</w:t>
+        <w:t>15.3 Locked flashcard and wheel tests</w:t>
       </w:r>
     </w:p>
     <w:p>
       <w:pPr>
         <w:pStyle w:val="ListBullet"/>
-        <w:spacing w:after="160" w:line="280" w:lineRule="auto"/>
-        <w:ind w:left="720" w:hanging="360"/>
+      </w:pPr>
+      <w:r>
+        <w:t>Workbook row 2 is rank 1; logical ranks remain continuous through the final nonblank data row.</w:t>
+      </w:r>
+    </w:p>
+    <w:p>
+      <w:pPr>
+        <w:pStyle w:val="ListBullet"/>
+      </w:pPr>
+      <w:r>
+        <w:t>Words, Sentences, and combined modes show the correct front/back cells; combined word text is larger and bold on a near-full-tab card with no side-name text bars.</w:t>
+      </w:r>
+    </w:p>
+    <w:p>
+      <w:pPr>
+        <w:pStyle w:val="ListBullet"/>
+      </w:pPr>
+      <w:r>
+        <w:t>Inclusive full and partial ranges validate correctly; blank, reversed, zero, and over-limit ranges fail clearly.</w:t>
+      </w:r>
+    </w:p>
+    <w:p>
+      <w:pPr>
+        <w:pStyle w:val="ListBullet"/>
+      </w:pPr>
+      <w:r>
+        <w:t>Every eligible rank appears exactly once per cycle; navigation preserves order and restart restores all session state.</w:t>
+      </w:r>
+    </w:p>
+    <w:p>
+      <w:pPr>
+        <w:pStyle w:val="ListBullet"/>
+      </w:pPr>
+      <w:r>
+        <w:t>Hovered, focused, and previously clicked dropdowns, numeric fields, and sliders remain unchanged while the containing page scrolls; values change only through explicit controls or keyboard input.</w:t>
+      </w:r>
+    </w:p>
+    <w:p>
+      <w:pPr>
+        <w:pStyle w:val="Heading1"/>
+      </w:pPr>
+      <w:r>
+        <w:t>16. Release acceptance</w:t>
+      </w:r>
+    </w:p>
+    <w:p>
+      <w:pPr>
+        <w:spacing w:after="80" w:line="280" w:lineRule="auto"/>
+        <w:ind w:left="360" w:firstLine="0"/>
       </w:pPr>
       <w:r>
         <w:t>☒ Seven languages, eight script options, and 40,000 production records pass the automated corpus gate.</w:t>
@@ -2964,9 +3229,8 @@
     </w:p>
     <w:p>
       <w:pPr>
-        <w:pStyle w:val="ListBullet"/>
-        <w:spacing w:after="160" w:line="280" w:lineRule="auto"/>
-        <w:ind w:left="720" w:hanging="360"/>
+        <w:spacing w:after="80" w:line="280" w:lineRule="auto"/>
+        <w:ind w:left="360" w:firstLine="0"/>
       </w:pPr>
       <w:r>
         <w:t>☒ No configuration exceeds 5,000 rows; POS-aware and invariant form paths pass.</w:t>
@@ -2974,9 +3238,8 @@
     </w:p>
     <w:p>
       <w:pPr>
-        <w:pStyle w:val="ListBullet"/>
-        <w:spacing w:after="160" w:line="280" w:lineRule="auto"/>
-        <w:ind w:left="720" w:hanging="360"/>
+        <w:spacing w:after="80" w:line="280" w:lineRule="auto"/>
+        <w:ind w:left="360" w:firstLine="0"/>
       </w:pPr>
       <w:r>
         <w:t>☒ All provider, generation, workbook, TTS recovery, history safety, UI, security, and performance gates pass.</w:t>
@@ -2984,9 +3247,8 @@
     </w:p>
     <w:p>
       <w:pPr>
-        <w:pStyle w:val="ListBullet"/>
-        <w:spacing w:after="160" w:line="280" w:lineRule="auto"/>
-        <w:ind w:left="720" w:hanging="360"/>
+        <w:spacing w:after="80" w:line="280" w:lineRule="auto"/>
+        <w:ind w:left="360" w:firstLine="0"/>
       </w:pPr>
       <w:r>
         <w:t>☒ Clean Windows 10/11 machines install and run without separate Python, Qt, or FFmpeg downloads.</w:t>
@@ -2994,9 +3256,8 @@
     </w:p>
     <w:p>
       <w:pPr>
-        <w:pStyle w:val="ListBullet"/>
-        <w:spacing w:after="160" w:line="280" w:lineRule="auto"/>
-        <w:ind w:left="720" w:hanging="360"/>
+        <w:spacing w:after="80" w:line="280" w:lineRule="auto"/>
+        <w:ind w:left="360" w:firstLine="0"/>
       </w:pPr>
       <w:r>
         <w:t>☒ README, source notices, licence inventory, release notes, checksum, and provenance are included.</w:t>
@@ -3004,9 +3265,8 @@
     </w:p>
     <w:p>
       <w:pPr>
-        <w:pStyle w:val="ListBullet"/>
-        <w:spacing w:after="160" w:line="280" w:lineRule="auto"/>
-        <w:ind w:left="720" w:hanging="360"/>
+        <w:spacing w:after="80" w:line="280" w:lineRule="auto"/>
+        <w:ind w:left="360" w:firstLine="0"/>
       </w:pPr>
       <w:r>
         <w:t>☒ No critical/high defect or failing required check remains; release automation applies Authenticode signing whenever protected publisher certificate secrets are configured.</w:t>
@@ -3014,10 +3274,19 @@
     </w:p>
     <w:p>
       <w:pPr>
+        <w:spacing w:after="80"/>
+        <w:ind w:left="360" w:firstLine="0"/>
+      </w:pPr>
+      <w:r>
+        <w:t>☐ v1.3.0 Information guide, flashcard migration, restart recovery, wheel interaction, and Windows installer gates pass before release approval.</w:t>
+      </w:r>
+    </w:p>
+    <w:p>
+      <w:pPr>
         <w:pStyle w:val="Heading1"/>
       </w:pPr>
       <w:r>
-        <w:t>16. Current implementation status</w:t>
+        <w:t>17. Current implementation status</w:t>
       </w:r>
     </w:p>
     <w:p>
@@ -3025,7 +3294,7 @@
         <w:spacing w:after="120" w:line="264" w:lineRule="auto"/>
       </w:pPr>
       <w:r>
-        <w:t>Version 1.1.0 is the completed Thai and Windows identity release. It includes eight language/script options, 40,000 ranked records, Thai script and tone-marked Paiboon romanization, Thai voice discovery, the globe-and-open-book logo, a native multi-size Windows icon, and explicit taskbar identity. Quality, Tests, corpus validation, clean Windows 10/11 acceptance, packaging, checksum, provenance, upgrade, uninstall, and user-data preservation gates are required. Tag-driven GitHub release automation publishes the installer and portable archive; Authenticode signing remains automatic when protected publisher certificate secrets are configured.</w:t>
+        <w:t>Version 1.3.0 RC extends the completed v1.1.0 Thai and Windows identity release with ranked workbook flashcards, persistent study sessions, inclusive row filtering, a full-card light/dark study layout, History/Desktop loading, reusable lazy card audio, strict mouse-wheel input safety, and an offline Information page containing the complete numbered operating guide. Development remains isolated from GitHub main and the published v1.1.0 installer. Quality, Tests, corpus validation, Windows UI, packaged-manual, checksum, provenance, upgrade, uninstall, and user-data preservation gates are required before explicit approval, merge, or release publication.</w:t>
       </w:r>
     </w:p>
     <w:sectPr>
@@ -3257,6 +3526,24 @@
   </w:num>
   <w:num w:numId="9">
     <w:abstractNumId w:val="0"/>
+  </w:num>
+  <w:num w:numId="10">
+    <w:abstractNumId w:val="7"/>
+    <w:lvlOverride w:ilvl="0">
+      <w:startOverride w:val="1"/>
+    </w:lvlOverride>
+  </w:num>
+  <w:num w:numId="11">
+    <w:abstractNumId w:val="7"/>
+    <w:lvlOverride w:ilvl="0">
+      <w:startOverride w:val="1"/>
+    </w:lvlOverride>
+  </w:num>
+  <w:num w:numId="12">
+    <w:abstractNumId w:val="7"/>
+    <w:lvlOverride w:ilvl="0">
+      <w:startOverride w:val="1"/>
+    </w:lvlOverride>
   </w:num>
 </w:numbering>
 </file>

</xml_diff>